<commit_message>
added obj res agent
</commit_message>
<xml_diff>
--- a/docs/SF Data Migration Tool — Selectively Agentic Architecture.docx
+++ b/docs/SF Data Migration Tool — Selectively Agentic Architecture.docx
@@ -59,10 +59,10 @@
         <w:rPr>
           <w:b/>
         </w:rPr>
-        <w:t xml:space="preserve">Only the ETL touches data.</w:t>
-      </w:r>
-      <w:r>
-        <w:t xml:space="preserve">Agents read schema, dependency graphs and error summaries. They never read record payloads in bulk, never write to Salesforce, and never modify staged files.</w:t>
+        <w:t xml:space="preserve">Only the ETL moves data.</w:t>
+      </w:r>
+      <w:r>
+        <w:t xml:space="preserve">Agents read schema, dependency graphs and error summaries. They never write to Salesforce and never modify staged files. The one place an agent sees record values is post-load diagnosis: a capped, truncated sample of the rows Salesforce rejected, because some failures cannot be explained from schema alone. A single setting turns those values off for a client whose data may not leave our side.</w:t>
       </w:r>
     </w:p>
     <w:p>
@@ -81,7 +81,7 @@
         <w:t xml:space="preserve">Humans own field-to-field mapping.</w:t>
       </w:r>
       <w:r>
-        <w:t xml:space="preserve">Choosing that a source field belongs in a particular Salesforce field remains a human decision, supported by the existing auto-suggest.</w:t>
+        <w:t xml:space="preserve">Choosing that a source field belongs in a particular Salesforce field remains a human decision, supported by a model-assisted pass that proposes pairings and never writes one.</w:t>
       </w:r>
     </w:p>
     <w:p>
@@ -135,10 +135,10 @@
         <w:rPr>
           <w:b/>
         </w:rPr>
-        <w:t xml:space="preserve">Every change is validated before it is written.</w:t>
-      </w:r>
-      <w:r>
-        <w:t xml:space="preserve">The agent's work is checked against the live Salesforce describe and an allow-list of transform functions. Anything that fails validation is discarded rather than applied, and everything applied is recorded and reversible.</w:t>
+        <w:t xml:space="preserve">What repair cannot fix, a person approves.</w:t>
+      </w:r>
+      <w:r>
+        <w:t xml:space="preserve">Load failures left after automatic repair are explained, and the fix is offered as a proposal with a before/after. Nothing is written until someone clicks Apply, and applying never calls the model.</w:t>
       </w:r>
     </w:p>
     <w:p>
@@ -154,10 +154,10 @@
         <w:rPr>
           <w:b/>
         </w:rPr>
-        <w:t xml:space="preserve">Staged, not streaming.</w:t>
-      </w:r>
-      <w:r>
-        <w:t xml:space="preserve">All selected source data lands on our side before any transform runs, so repair and retry operate on local data and never re-query the source system.</w:t>
+        <w:t xml:space="preserve">Every change is validated before it is written.</w:t>
+      </w:r>
+      <w:r>
+        <w:t xml:space="preserve">The agent's work is checked against the live Salesforce describe and an allow-list of transform functions. Anything that fails validation is discarded rather than applied, and everything applied is recorded and reversible.</w:t>
       </w:r>
     </w:p>
     <w:p>
@@ -173,6 +173,25 @@
         <w:rPr>
           <w:b/>
         </w:rPr>
+        <w:t xml:space="preserve">Staged, not streaming.</w:t>
+      </w:r>
+      <w:r>
+        <w:t xml:space="preserve">All selected source data lands on our side before any transform runs, so repair and retry operate on local data and never re-query the source system.</w:t>
+      </w:r>
+    </w:p>
+    <w:p>
+      <w:pPr>
+        <w:pStyle w:val="ListParagraph"/>
+        <w:numPr>
+          <w:ilvl w:val="0"/>
+          <w:numId w:val="2"/>
+        </w:numPr>
+        <w:spacing w:before="40" w:after="100"/>
+      </w:pPr>
+      <w:r>
+        <w:rPr>
+          <w:b/>
+        </w:rPr>
         <w:t xml:space="preserve">Degrades to today's behaviour.</w:t>
       </w:r>
       <w:r>
@@ -189,7 +208,7 @@
     </w:p>
     <w:p>
       <w:r>
-        <w:t xml:space="preserve">A migration runs as the numbered sequence below, start to finish, split into the two halves it naturally has: the design-time half on the left, where the migration is configured and nothing has moved yet, and the run itself on the right. Every step already exists today except the three highlighted ones —</w:t>
+        <w:t xml:space="preserve">A migration runs as the numbered sequence below, start to finish, split into the two halves it naturally has: the design-time half on the left, where the migration is configured and nothing has moved yet, and the run itself on the right. Every step already exists today except the highlighted ones —</w:t>
       </w:r>
       <w:r>
         <w:rPr>
@@ -198,6 +217,15 @@
         <w:t xml:space="preserve">step 2, step 4 and step 11</w:t>
       </w:r>
       <w:r>
+        <w:t xml:space="preserve">, with step 11 now followed by a diagnosis step,</w:t>
+      </w:r>
+      <w:r>
+        <w:rPr>
+          <w:b/>
+        </w:rPr>
+        <w:t xml:space="preserve">11b</w:t>
+      </w:r>
+      <w:r>
         <w:t xml:space="preserve">— which are the entire scope of this work. Following the numbers is the clearest way to see how little of the pipeline changes.</w:t>
       </w:r>
     </w:p>
@@ -209,7 +237,7 @@
       <w:r>
         <w:drawing>
           <wp:inline distT="0" distB="0" distL="0" distR="0">
-            <wp:extent cx="5608107" cy="7680960"/>
+            <wp:extent cx="4058964" cy="7680960"/>
             <wp:effectExtent l="0" t="0" r="0" b="0"/>
             <wp:docPr id="101" name="Diagram 101"/>
             <wp:cNvGraphicFramePr>
@@ -219,7 +247,7 @@
               <a:graphicData uri="http://schemas.openxmlformats.org/drawingml/2006/picture">
                 <pic:pic>
                   <pic:nvPicPr>
-                    <pic:cNvPr id="101" name="diagram-1.png"/>
+                    <pic:cNvPr id="101" name="architecture-diagram-1.png"/>
                     <pic:cNvPicPr/>
                   </pic:nvPicPr>
                   <pic:blipFill>
@@ -231,7 +259,7 @@
                   <pic:spPr>
                     <a:xfrm>
                       <a:off x="0" y="0"/>
-                      <a:ext cx="5608107" cy="7680960"/>
+                      <a:ext cx="4058964" cy="7680960"/>
                     </a:xfrm>
                     <a:prstGeom prst="rect">
                       <a:avLst/>
@@ -255,6 +283,11 @@
     <w:p>
       <w:r>
         <w:t xml:space="preserve">The two halves matter because they carry different risk: everything on the left is reversible at no cost, while everything on the right is touching a live Salesforce org. Note also that step 7 is re-entered from two places: once per object group in the normal loop, and again after a repair — which is why a repair costs one object's transform rather than a restart.</w:t>
+      </w:r>
+    </w:p>
+    <w:p>
+      <w:r>
+        <w:t xml:space="preserve">Step 11b is the one step that ends with a person rather than a write. When rows are still rejected after the last repair attempt, the Diagnosis Agent explains why and attaches the mapping changes that would fix it. After the run, the migration engineer can discuss the failure with an assistant, apply one of those fixes as a reviewed proposal, and re-run only the affected object (section 6.4).</w:t>
       </w:r>
     </w:p>
     <w:p>
@@ -416,10 +449,10 @@
         </w:tblCellMar>
       </w:tblPr>
       <w:tblGrid>
-        <w:gridCol w:w="839"/>
-        <w:gridCol w:w="1682"/>
-        <w:gridCol w:w="2265"/>
-        <w:gridCol w:w="4852"/>
+        <w:gridCol w:w="895"/>
+        <w:gridCol w:w="1520"/>
+        <w:gridCol w:w="2047"/>
+        <w:gridCol w:w="5176"/>
       </w:tblGrid>
       <w:tr>
         <w:trPr>
@@ -428,7 +461,7 @@
         </w:trPr>
         <w:tc>
           <w:tcPr>
-            <w:tcW w:w="839" w:type="dxa"/>
+            <w:tcW w:w="895" w:type="dxa"/>
             <w:shd w:val="clear" w:color="auto" w:fill="E8F1F8"/>
             <w:vAlign w:val="top"/>
           </w:tcPr>
@@ -449,7 +482,7 @@
         </w:tc>
         <w:tc>
           <w:tcPr>
-            <w:tcW w:w="1682" w:type="dxa"/>
+            <w:tcW w:w="1520" w:type="dxa"/>
             <w:shd w:val="clear" w:color="auto" w:fill="E8F1F8"/>
             <w:vAlign w:val="top"/>
           </w:tcPr>
@@ -470,7 +503,7 @@
         </w:tc>
         <w:tc>
           <w:tcPr>
-            <w:tcW w:w="2265" w:type="dxa"/>
+            <w:tcW w:w="2047" w:type="dxa"/>
             <w:shd w:val="clear" w:color="auto" w:fill="E8F1F8"/>
             <w:vAlign w:val="top"/>
           </w:tcPr>
@@ -491,7 +524,7 @@
         </w:tc>
         <w:tc>
           <w:tcPr>
-            <w:tcW w:w="4852" w:type="dxa"/>
+            <w:tcW w:w="5176" w:type="dxa"/>
             <w:shd w:val="clear" w:color="auto" w:fill="E8F1F8"/>
             <w:vAlign w:val="top"/>
           </w:tcPr>
@@ -514,7 +547,7 @@
       <w:tr>
         <w:tc>
           <w:tcPr>
-            <w:tcW w:w="839" w:type="dxa"/>
+            <w:tcW w:w="895" w:type="dxa"/>
             <w:vAlign w:val="top"/>
           </w:tcPr>
           <w:p>
@@ -533,7 +566,7 @@
         </w:tc>
         <w:tc>
           <w:tcPr>
-            <w:tcW w:w="1682" w:type="dxa"/>
+            <w:tcW w:w="1520" w:type="dxa"/>
             <w:vAlign w:val="top"/>
           </w:tcPr>
           <w:p>
@@ -551,7 +584,7 @@
         </w:tc>
         <w:tc>
           <w:tcPr>
-            <w:tcW w:w="2265" w:type="dxa"/>
+            <w:tcW w:w="2047" w:type="dxa"/>
             <w:vAlign w:val="top"/>
           </w:tcPr>
           <w:p>
@@ -569,7 +602,7 @@
         </w:tc>
         <w:tc>
           <w:tcPr>
-            <w:tcW w:w="4852" w:type="dxa"/>
+            <w:tcW w:w="5176" w:type="dxa"/>
             <w:vAlign w:val="top"/>
           </w:tcPr>
           <w:p>
@@ -589,7 +622,7 @@
       <w:tr>
         <w:tc>
           <w:tcPr>
-            <w:tcW w:w="839" w:type="dxa"/>
+            <w:tcW w:w="895" w:type="dxa"/>
             <w:vAlign w:val="top"/>
           </w:tcPr>
           <w:p>
@@ -608,7 +641,7 @@
         </w:tc>
         <w:tc>
           <w:tcPr>
-            <w:tcW w:w="1682" w:type="dxa"/>
+            <w:tcW w:w="1520" w:type="dxa"/>
             <w:vAlign w:val="top"/>
           </w:tcPr>
           <w:p>
@@ -626,7 +659,7 @@
         </w:tc>
         <w:tc>
           <w:tcPr>
-            <w:tcW w:w="2265" w:type="dxa"/>
+            <w:tcW w:w="2047" w:type="dxa"/>
             <w:vAlign w:val="top"/>
           </w:tcPr>
           <w:p>
@@ -644,7 +677,7 @@
         </w:tc>
         <w:tc>
           <w:tcPr>
-            <w:tcW w:w="4852" w:type="dxa"/>
+            <w:tcW w:w="5176" w:type="dxa"/>
             <w:vAlign w:val="top"/>
           </w:tcPr>
           <w:p>
@@ -664,7 +697,7 @@
       <w:tr>
         <w:tc>
           <w:tcPr>
-            <w:tcW w:w="839" w:type="dxa"/>
+            <w:tcW w:w="895" w:type="dxa"/>
             <w:vAlign w:val="top"/>
           </w:tcPr>
           <w:p>
@@ -683,7 +716,7 @@
         </w:tc>
         <w:tc>
           <w:tcPr>
-            <w:tcW w:w="1682" w:type="dxa"/>
+            <w:tcW w:w="1520" w:type="dxa"/>
             <w:vAlign w:val="top"/>
           </w:tcPr>
           <w:p>
@@ -701,7 +734,7 @@
         </w:tc>
         <w:tc>
           <w:tcPr>
-            <w:tcW w:w="2265" w:type="dxa"/>
+            <w:tcW w:w="2047" w:type="dxa"/>
             <w:vAlign w:val="top"/>
           </w:tcPr>
           <w:p>
@@ -719,19 +752,19 @@
         </w:tc>
         <w:tc>
           <w:tcPr>
-            <w:tcW w:w="4852" w:type="dxa"/>
-            <w:vAlign w:val="top"/>
-          </w:tcPr>
-          <w:p>
-            <w:pPr>
-              <w:spacing w:before="20" w:after="20" w:line="240" w:lineRule="auto"/>
-            </w:pPr>
-            <w:r>
-              <w:rPr>
-                <w:sz w:val="19"/>
-                <w:szCs w:val="19"/>
-              </w:rPr>
-              <w:t xml:space="preserve">Field-level patches to transform functions and their parameters, followed by a re-transform and re-load of that single object from staged data.</w:t>
+            <w:tcW w:w="5176" w:type="dxa"/>
+            <w:vAlign w:val="top"/>
+          </w:tcPr>
+          <w:p>
+            <w:pPr>
+              <w:spacing w:before="20" w:after="20" w:line="240" w:lineRule="auto"/>
+            </w:pPr>
+            <w:r>
+              <w:rPr>
+                <w:sz w:val="19"/>
+                <w:szCs w:val="19"/>
+              </w:rPr>
+              <w:t xml:space="preserve">Fixed rules first for errors with exactly one correct fix, then the Repair Agent for the rest — field-level patches to transform functions and their parameters, followed by a re-transform and re-load of that single object from staged data. Whatever still fails is diagnosed (11b) and offered to a person as proposed fixes.</w:t>
             </w:r>
           </w:p>
         </w:tc>
@@ -1473,7 +1506,7 @@
       <w:r>
         <w:drawing>
           <wp:inline distT="0" distB="0" distL="0" distR="0">
-            <wp:extent cx="5760720" cy="4044907"/>
+            <wp:extent cx="5760720" cy="5202564"/>
             <wp:effectExtent l="0" t="0" r="0" b="0"/>
             <wp:docPr id="102" name="Diagram 102"/>
             <wp:cNvGraphicFramePr>
@@ -1483,7 +1516,7 @@
               <a:graphicData uri="http://schemas.openxmlformats.org/drawingml/2006/picture">
                 <pic:pic>
                   <pic:nvPicPr>
-                    <pic:cNvPr id="102" name="diagram-2.png"/>
+                    <pic:cNvPr id="102" name="architecture-diagram-2.png"/>
                     <pic:cNvPicPr/>
                   </pic:nvPicPr>
                   <pic:blipFill>
@@ -1495,7 +1528,7 @@
                   <pic:spPr>
                     <a:xfrm>
                       <a:off x="0" y="0"/>
-                      <a:ext cx="5760720" cy="4044907"/>
+                      <a:ext cx="5760720" cy="5202564"/>
                     </a:xfrm>
                     <a:prstGeom prst="rect">
                       <a:avLst/>
@@ -1513,7 +1546,7 @@
         <w:pStyle w:val="Caption"/>
       </w:pPr>
       <w:r>
-        <w:t xml:space="preserve">Diagram 2 — Resolution loop at design time; repair loop at run time.</w:t>
+        <w:t xml:space="preserve">Diagram 2 — Resolution loop at design time; repair loop at run time; diagnosis and human approval for what repair could not fix.</w:t>
       </w:r>
     </w:p>
     <w:p>
@@ -2680,7 +2713,7 @@
     </w:p>
     <w:p>
       <w:r>
-        <w:t xml:space="preserve">The loader already extracts unique error messages from Salesforce's failed-record output and returns them per object. The repair agent receives that error summary, the object's mapping configuration, and the destination field metadata. It never sees record data — only error text and schema — which keeps the same data-handling posture as the Relationship Agent.</w:t>
+        <w:t xml:space="preserve">The loader already extracts unique error messages from Salesforce's failed-record output and returns them per object. The repair agent receives that error summary, the object's mapping configuration, and the destination field metadata. Beyond error text and schema it sees at most a couple of short sample values per error class, because the offending value is often the only way to tell a wrong date format from a wrong timezone. Those samples can be switched off entirely.</w:t>
       </w:r>
     </w:p>
     <w:p>
@@ -3022,15 +3055,7 @@
         <w:t xml:space="preserve">Stopping conditions.</w:t>
       </w:r>
       <w:r>
-        <w:t xml:space="preserve">A capped number of repair attempts per object per run. Abort immediately if an attempt does not reduce the failure count, if the error class is on the non-repairable list, or if the same patch has already been tried. A run that exhausts repair finishes in the existing completed-with-errors state with the unresolved errors attached — the agent can improve an outcome but never worsen one.</w:t>
-      </w:r>
-    </w:p>
-    <w:p>
-      <w:pPr>
-        <w:pStyle w:val="Heading1"/>
-      </w:pPr>
-      <w:r>
-        <w:t xml:space="preserve">7. State and interfaces</w:t>
+        <w:t xml:space="preserve">A capped number of repair attempts per object per run. Abort immediately if an attempt does not reduce the failure count, if the error class is on the non-repairable list, or if the same patch has already been tried. A run that exhausts repair finishes in the existing completed-with-errors state with the unresolved errors attached — the agent can improve an outcome but never worsen one. A retry that "fixes" a rejection by making the transform discard the row still counts as a failure.</w:t>
       </w:r>
     </w:p>
     <w:p>
@@ -3038,85 +3063,12 @@
         <w:pStyle w:val="Heading2"/>
       </w:pPr>
       <w:r>
-        <w:t xml:space="preserve">7.1 New state</w:t>
-      </w:r>
-    </w:p>
-    <w:p>
-      <w:r>
-        <w:t xml:space="preserve">One new table records agent activity. Every row captures the session and object it concerns, the agent and phase, a digest of the inputs, the change the agent made, the validation verdict, whether it was applied, the prior value it replaced, the model identifier, and token counts. Because the agent writes rather than suggests, this table is doing three jobs at once: it is the audit trail, the mechanism that makes any individual change reversible, and the cost ledger. It also feeds the scenario-frequency analysis described in section 5.5.</w:t>
-      </w:r>
-    </w:p>
-    <w:p>
-      <w:pPr>
-        <w:pStyle w:val="Heading2"/>
-      </w:pPr>
-      <w:r>
-        <w:t xml:space="preserve">7.2 Existing state the agents depend on</w:t>
-      </w:r>
-    </w:p>
-    <w:p>
-      <w:pPr>
-        <w:pStyle w:val="ListParagraph"/>
-        <w:numPr>
-          <w:ilvl w:val="0"/>
-          <w:numId w:val="1"/>
-        </w:numPr>
-        <w:spacing w:before="40" w:after="100"/>
-      </w:pPr>
-      <w:r>
-        <w:rPr>
-          <w:b/>
-        </w:rPr>
-        <w:t xml:space="preserve">Mapping configurations</w:t>
-      </w:r>
-      <w:r>
-        <w:t xml:space="preserve">— the only design-time write target. The agent adds transform functions, their parameters, and load priorities to the same structure the wizard already saves; nothing structurally new is introduced, which is why its output needs no special handling downstream.</w:t>
-      </w:r>
-    </w:p>
-    <w:p>
-      <w:pPr>
-        <w:pStyle w:val="ListParagraph"/>
-        <w:numPr>
-          <w:ilvl w:val="0"/>
-          <w:numId w:val="1"/>
-        </w:numPr>
-        <w:spacing w:before="40" w:after="100"/>
-      </w:pPr>
-      <w:r>
-        <w:rPr>
-          <w:b/>
-        </w:rPr>
-        <w:t xml:space="preserve">Identifier maps</w:t>
-      </w:r>
-      <w:r>
-        <w:t xml:space="preserve">— populated during load, read by lookup transforms. The agent registers them as part of wiring a relationship, always deriving the name from the shared naming helper rather than composing one. Hand-built names are the most common relationship defect in the current process, and the validator checks for exactly this before anything is written.</w:t>
-      </w:r>
-    </w:p>
-    <w:p>
-      <w:pPr>
-        <w:pStyle w:val="ListParagraph"/>
-        <w:numPr>
-          <w:ilvl w:val="0"/>
-          <w:numId w:val="1"/>
-        </w:numPr>
-        <w:spacing w:before="40" w:after="100"/>
-      </w:pPr>
-      <w:r>
-        <w:rPr>
-          <w:b/>
-        </w:rPr>
-        <w:t xml:space="preserve">Job and batch records</w:t>
-      </w:r>
-      <w:r>
-        <w:t xml:space="preserve">— repair retries reuse the same job identifiers so run history stays coherent and a repaired run reads as one run.</w:t>
-      </w:r>
-    </w:p>
-    <w:p>
-      <w:pPr>
-        <w:pStyle w:val="Heading2"/>
-      </w:pPr>
-      <w:r>
-        <w:t xml:space="preserve">7.3 Interfaces</w:t>
+        <w:t xml:space="preserve">6.3 Fixed rules before the model</w:t>
+      </w:r>
+    </w:p>
+    <w:p>
+      <w:r>
+        <w:t xml:space="preserve">Some Salesforce errors have exactly one correct fix, and asking a model for it costs time, tokens and reproducibility. Those are now handled by deterministic rules that run before the Repair Agent, with no model call. When the rules handle every error on an object, the model is not called at all; otherwise it sees only the errors the rules did not recognise.</w:t>
       </w:r>
     </w:p>
     <w:tbl>
@@ -3139,8 +3091,8 @@
         </w:tblCellMar>
       </w:tblPr>
       <w:tblGrid>
-        <w:gridCol w:w="2122"/>
-        <w:gridCol w:w="7516"/>
+        <w:gridCol w:w="3406"/>
+        <w:gridCol w:w="6232"/>
       </w:tblGrid>
       <w:tr>
         <w:trPr>
@@ -3149,7 +3101,7 @@
         </w:trPr>
         <w:tc>
           <w:tcPr>
-            <w:tcW w:w="2122" w:type="dxa"/>
+            <w:tcW w:w="3406" w:type="dxa"/>
             <w:shd w:val="clear" w:color="auto" w:fill="E8F1F8"/>
             <w:vAlign w:val="top"/>
           </w:tcPr>
@@ -3164,13 +3116,13 @@
                 <w:sz w:val="19"/>
                 <w:szCs w:val="19"/>
               </w:rPr>
-              <w:t xml:space="preserve">Interface</w:t>
-            </w:r>
-          </w:p>
-        </w:tc>
-        <w:tc>
-          <w:tcPr>
-            <w:tcW w:w="7516" w:type="dxa"/>
+              <w:t xml:space="preserve">Error</w:t>
+            </w:r>
+          </w:p>
+        </w:tc>
+        <w:tc>
+          <w:tcPr>
+            <w:tcW w:w="6232" w:type="dxa"/>
             <w:shd w:val="clear" w:color="auto" w:fill="E8F1F8"/>
             <w:vAlign w:val="top"/>
           </w:tcPr>
@@ -3185,159 +3137,197 @@
                 <w:sz w:val="19"/>
                 <w:szCs w:val="19"/>
               </w:rPr>
-              <w:t xml:space="preserve">Purpose</w:t>
-            </w:r>
-          </w:p>
-        </w:tc>
-      </w:tr>
-      <w:tr>
-        <w:tc>
-          <w:tcPr>
-            <w:tcW w:w="2122" w:type="dxa"/>
-            <w:vAlign w:val="top"/>
-          </w:tcPr>
-          <w:p>
-            <w:pPr>
-              <w:spacing w:before="20" w:after="20" w:line="240" w:lineRule="auto"/>
-            </w:pPr>
-            <w:r>
-              <w:rPr>
-                <w:sz w:val="19"/>
-                <w:szCs w:val="19"/>
-              </w:rPr>
-              <w:t xml:space="preserve">Resolve endpoint</w:t>
-            </w:r>
-          </w:p>
-        </w:tc>
-        <w:tc>
-          <w:tcPr>
-            <w:tcW w:w="7516" w:type="dxa"/>
-            <w:vAlign w:val="top"/>
-          </w:tcPr>
-          <w:p>
-            <w:pPr>
-              <w:spacing w:before="20" w:after="20" w:line="240" w:lineRule="auto"/>
-            </w:pPr>
-            <w:r>
-              <w:rPr>
-                <w:sz w:val="19"/>
-                <w:szCs w:val="19"/>
-              </w:rPr>
-              <w:t xml:space="preserve">Takes the current selection and credential references. Runs the agent, validates its conclusions, writes the resulting configuration, and returns a change log, the outstanding blockers, and token usage.</w:t>
-            </w:r>
-          </w:p>
-        </w:tc>
-      </w:tr>
-      <w:tr>
-        <w:tc>
-          <w:tcPr>
-            <w:tcW w:w="2122" w:type="dxa"/>
-            <w:vAlign w:val="top"/>
-          </w:tcPr>
-          <w:p>
-            <w:pPr>
-              <w:spacing w:before="20" w:after="20" w:line="240" w:lineRule="auto"/>
-            </w:pPr>
-            <w:r>
-              <w:rPr>
-                <w:sz w:val="19"/>
-                <w:szCs w:val="19"/>
-              </w:rPr>
-              <w:t xml:space="preserve">Preview mode on the same endpoint</w:t>
-            </w:r>
-          </w:p>
-        </w:tc>
-        <w:tc>
-          <w:tcPr>
-            <w:tcW w:w="7516" w:type="dxa"/>
-            <w:vAlign w:val="top"/>
-          </w:tcPr>
-          <w:p>
-            <w:pPr>
-              <w:spacing w:before="20" w:after="20" w:line="240" w:lineRule="auto"/>
-            </w:pPr>
-            <w:r>
-              <w:rPr>
-                <w:sz w:val="19"/>
-                <w:szCs w:val="19"/>
-              </w:rPr>
-              <w:t xml:space="preserve">Identical analysis with the write suppressed. Useful for a first run on an unfamiliar client dataset, and for testing.</w:t>
-            </w:r>
-          </w:p>
-        </w:tc>
-      </w:tr>
-      <w:tr>
-        <w:tc>
-          <w:tcPr>
-            <w:tcW w:w="2122" w:type="dxa"/>
-            <w:vAlign w:val="top"/>
-          </w:tcPr>
-          <w:p>
-            <w:pPr>
-              <w:spacing w:before="20" w:after="20" w:line="240" w:lineRule="auto"/>
-            </w:pPr>
-            <w:r>
-              <w:rPr>
-                <w:sz w:val="19"/>
-                <w:szCs w:val="19"/>
-              </w:rPr>
-              <w:t xml:space="preserve">Revert endpoint</w:t>
-            </w:r>
-          </w:p>
-        </w:tc>
-        <w:tc>
-          <w:tcPr>
-            <w:tcW w:w="7516" w:type="dxa"/>
-            <w:vAlign w:val="top"/>
-          </w:tcPr>
-          <w:p>
-            <w:pPr>
-              <w:spacing w:before="20" w:after="20" w:line="240" w:lineRule="auto"/>
-            </w:pPr>
-            <w:r>
-              <w:rPr>
-                <w:sz w:val="19"/>
-                <w:szCs w:val="19"/>
-              </w:rPr>
-              <w:t xml:space="preserve">Takes a change reference and restores the prior value from the audit record. Reversal is per item, not per run.</w:t>
-            </w:r>
-          </w:p>
-        </w:tc>
-      </w:tr>
-      <w:tr>
-        <w:tc>
-          <w:tcPr>
-            <w:tcW w:w="2122" w:type="dxa"/>
-            <w:vAlign w:val="top"/>
-          </w:tcPr>
-          <w:p>
-            <w:pPr>
-              <w:spacing w:before="20" w:after="20" w:line="240" w:lineRule="auto"/>
-            </w:pPr>
-            <w:r>
-              <w:rPr>
-                <w:sz w:val="19"/>
-                <w:szCs w:val="19"/>
-              </w:rPr>
-              <w:t xml:space="preserve">Notices endpoint</w:t>
-            </w:r>
-          </w:p>
-        </w:tc>
-        <w:tc>
-          <w:tcPr>
-            <w:tcW w:w="7516" w:type="dxa"/>
-            <w:vAlign w:val="top"/>
-          </w:tcPr>
-          <w:p>
-            <w:pPr>
-              <w:spacing w:before="20" w:after="20" w:line="240" w:lineRule="auto"/>
-            </w:pPr>
-            <w:r>
-              <w:rPr>
-                <w:sz w:val="19"/>
-                <w:szCs w:val="19"/>
-              </w:rPr>
-              <w:t xml:space="preserve">Serves current relationship notices for the pre-launch banner and the run view.</w:t>
+              <w:t xml:space="preserve">What the rule wires</w:t>
+            </w:r>
+          </w:p>
+        </w:tc>
+      </w:tr>
+      <w:tr>
+        <w:tc>
+          <w:tcPr>
+            <w:tcW w:w="3406" w:type="dxa"/>
+            <w:vAlign w:val="top"/>
+          </w:tcPr>
+          <w:p>
+            <w:pPr>
+              <w:spacing w:before="20" w:after="20" w:line="240" w:lineRule="auto"/>
+            </w:pPr>
+            <w:r>
+              <w:rPr>
+                <w:sz w:val="19"/>
+                <w:szCs w:val="19"/>
+              </w:rPr>
+              <w:t xml:space="preserve">A raw source identifier sent to a lookup</w:t>
+            </w:r>
+          </w:p>
+        </w:tc>
+        <w:tc>
+          <w:tcPr>
+            <w:tcW w:w="6232" w:type="dxa"/>
+            <w:vAlign w:val="top"/>
+          </w:tcPr>
+          <w:p>
+            <w:pPr>
+              <w:spacing w:before="20" w:after="20" w:line="240" w:lineRule="auto"/>
+            </w:pPr>
+            <w:r>
+              <w:rPr>
+                <w:sz w:val="19"/>
+                <w:szCs w:val="19"/>
+              </w:rPr>
+              <w:t xml:space="preserve">The identifier lookup against the map the parent mapping populates</w:t>
+            </w:r>
+          </w:p>
+        </w:tc>
+      </w:tr>
+      <w:tr>
+        <w:tc>
+          <w:tcPr>
+            <w:tcW w:w="3406" w:type="dxa"/>
+            <w:vAlign w:val="top"/>
+          </w:tcPr>
+          <w:p>
+            <w:pPr>
+              <w:spacing w:before="20" w:after="20" w:line="240" w:lineRule="auto"/>
+            </w:pPr>
+            <w:r>
+              <w:rPr>
+                <w:sz w:val="19"/>
+                <w:szCs w:val="19"/>
+              </w:rPr>
+              <w:t xml:space="preserve">A validation rule stating a minimum and maximum length</w:t>
+            </w:r>
+          </w:p>
+        </w:tc>
+        <w:tc>
+          <w:tcPr>
+            <w:tcW w:w="6232" w:type="dxa"/>
+            <w:vAlign w:val="top"/>
+          </w:tcPr>
+          <w:p>
+            <w:pPr>
+              <w:spacing w:before="20" w:after="20" w:line="240" w:lineRule="auto"/>
+            </w:pPr>
+            <w:r>
+              <w:rPr>
+                <w:sz w:val="19"/>
+                <w:szCs w:val="19"/>
+              </w:rPr>
+              <w:t xml:space="preserve">A length guard with those limits, tightened a character at a time if the rule rejects its own boundary</w:t>
+            </w:r>
+          </w:p>
+        </w:tc>
+      </w:tr>
+      <w:tr>
+        <w:tc>
+          <w:tcPr>
+            <w:tcW w:w="3406" w:type="dxa"/>
+            <w:vAlign w:val="top"/>
+          </w:tcPr>
+          <w:p>
+            <w:pPr>
+              <w:spacing w:before="20" w:after="20" w:line="240" w:lineRule="auto"/>
+            </w:pPr>
+            <w:r>
+              <w:rPr>
+                <w:sz w:val="19"/>
+                <w:szCs w:val="19"/>
+              </w:rPr>
+              <w:t xml:space="preserve">Value too long for the field</w:t>
+            </w:r>
+          </w:p>
+        </w:tc>
+        <w:tc>
+          <w:tcPr>
+            <w:tcW w:w="6232" w:type="dxa"/>
+            <w:vAlign w:val="top"/>
+          </w:tcPr>
+          <w:p>
+            <w:pPr>
+              <w:spacing w:before="20" w:after="20" w:line="240" w:lineRule="auto"/>
+            </w:pPr>
+            <w:r>
+              <w:rPr>
+                <w:sz w:val="19"/>
+                <w:szCs w:val="19"/>
+              </w:rPr>
+              <w:t xml:space="preserve">A length guard at the stated or described length, allowing for line breaks counting double on the wire</w:t>
+            </w:r>
+          </w:p>
+        </w:tc>
+      </w:tr>
+      <w:tr>
+        <w:tc>
+          <w:tcPr>
+            <w:tcW w:w="3406" w:type="dxa"/>
+            <w:vAlign w:val="top"/>
+          </w:tcPr>
+          <w:p>
+            <w:pPr>
+              <w:spacing w:before="20" w:after="20" w:line="240" w:lineRule="auto"/>
+            </w:pPr>
+            <w:r>
+              <w:rPr>
+                <w:sz w:val="19"/>
+                <w:szCs w:val="19"/>
+              </w:rPr>
+              <w:t xml:space="preserve">"X must be after Y" on dates</w:t>
+            </w:r>
+          </w:p>
+        </w:tc>
+        <w:tc>
+          <w:tcPr>
+            <w:tcW w:w="6232" w:type="dxa"/>
+            <w:vAlign w:val="top"/>
+          </w:tcPr>
+          <w:p>
+            <w:pPr>
+              <w:spacing w:before="20" w:after="20" w:line="240" w:lineRule="auto"/>
+            </w:pPr>
+            <w:r>
+              <w:rPr>
+                <w:sz w:val="19"/>
+                <w:szCs w:val="19"/>
+              </w:rPr>
+              <w:t xml:space="preserve">A conditional rule that clears the dependent date whenever its prerequisite is empty at the source</w:t>
+            </w:r>
+          </w:p>
+        </w:tc>
+      </w:tr>
+      <w:tr>
+        <w:tc>
+          <w:tcPr>
+            <w:tcW w:w="3406" w:type="dxa"/>
+            <w:vAlign w:val="top"/>
+          </w:tcPr>
+          <w:p>
+            <w:pPr>
+              <w:spacing w:before="20" w:after="20" w:line="240" w:lineRule="auto"/>
+            </w:pPr>
+            <w:r>
+              <w:rPr>
+                <w:sz w:val="19"/>
+                <w:szCs w:val="19"/>
+              </w:rPr>
+              <w:t xml:space="preserve">A field a validation rule makes required</w:t>
+            </w:r>
+          </w:p>
+        </w:tc>
+        <w:tc>
+          <w:tcPr>
+            <w:tcW w:w="6232" w:type="dxa"/>
+            <w:vAlign w:val="top"/>
+          </w:tcPr>
+          <w:p>
+            <w:pPr>
+              <w:spacing w:before="20" w:after="20" w:line="240" w:lineRule="auto"/>
+            </w:pPr>
+            <w:r>
+              <w:rPr>
+                <w:sz w:val="19"/>
+                <w:szCs w:val="19"/>
+              </w:rPr>
+              <w:t xml:space="preserve">Maps it from the best-matching source column with a fallback default, or a constant when nothing matches</w:t>
             </w:r>
           </w:p>
         </w:tc>
@@ -3350,7 +3340,105 @@
     </w:p>
     <w:p>
       <w:r>
-        <w:t xml:space="preserve">Interface changes in the web application:</w:t>
+        <w:t xml:space="preserve">Every rule-made change is recorded and reversible exactly like an agent change, and appears in the same change log.</w:t>
+      </w:r>
+    </w:p>
+    <w:p>
+      <w:pPr>
+        <w:pStyle w:val="Heading2"/>
+      </w:pPr>
+      <w:r>
+        <w:t xml:space="preserve">6.4 Diagnosis, the assistant, and proposals</w:t>
+      </w:r>
+    </w:p>
+    <w:p>
+      <w:r>
+        <w:t xml:space="preserve">Repair deliberately stops at what it can fix safely. When rows are still rejected after the last attempt, the</w:t>
+      </w:r>
+      <w:r>
+        <w:rPr>
+          <w:b/>
+        </w:rPr>
+        <w:t xml:space="preserve">Diagnosis Agent</w:t>
+      </w:r>
+      <w:r>
+        <w:t xml:space="preserve">takes over. Its job is not to change anything but to explain: it reads a small sample of the rejected rows alongside the staged source rows they came from, sizes the problem by profiling the relevant source column, and says in plain language whether this is a data problem, a mapping problem or a destination rule. It then ranks two or three fixes with their trade-offs. Where a mapping change would work, the fix carries it, already validated. Where it needs a person — a validation rule to relax, source data to correct — it says who needs to do what.</w:t>
+      </w:r>
+    </w:p>
+    <w:p>
+      <w:r>
+        <w:t xml:space="preserve">The migration engineer can then talk to an</w:t>
+      </w:r>
+      <w:r>
+        <w:rPr>
+          <w:b/>
+        </w:rPr>
+        <w:t xml:space="preserve">assistant</w:t>
+      </w:r>
+      <w:r>
+        <w:t xml:space="preserve">about the session's failures, using the same investigation tools. The assistant cannot change a mapping. When a change is needed it stores a</w:t>
+      </w:r>
+      <w:r>
+        <w:rPr>
+          <w:i/>
+        </w:rPr>
+        <w:t xml:space="preserve">proposal</w:t>
+      </w:r>
+      <w:r>
+        <w:t xml:space="preserve">: the validated changes, applied to a draft to show a before/after, waiting for a decision. Apply is a separate, deterministic step. It re-validates the change, refuses if the mapping has moved on since the preview or the session is running, records every change so it can be reverted, and then offers to re-run only the affected object.</w:t>
+      </w:r>
+    </w:p>
+    <w:p>
+      <w:pPr>
+        <w:pBdr>
+          <w:left w:val="single" w:sz="18" w:space="8" w:color="2C5F7C"/>
+        </w:pBdr>
+        <w:shd w:val="clear" w:color="auto" w:fill="E8F1F8"/>
+        <w:spacing w:before="200" w:after="200"/>
+        <w:ind w:left="170" w:right="140"/>
+      </w:pPr>
+      <w:r>
+        <w:rPr>
+          <w:b/>
+        </w:rPr>
+        <w:t xml:space="preserve">Why this layer asks rather than acts.</w:t>
+      </w:r>
+      <w:r>
+        <w:t xml:space="preserve">By the time a failure reaches diagnosis, the safe mechanical fixes have been tried. What is left usually involves a judgement about the client's data — clear a date, or default it, or leave the record out — which is exactly the decision the first design rules reserve for a person. Making it one click keeps that cheap.</w:t>
+      </w:r>
+    </w:p>
+    <w:p>
+      <w:pPr>
+        <w:pStyle w:val="Heading1"/>
+      </w:pPr>
+      <w:r>
+        <w:t xml:space="preserve">7. State and interfaces</w:t>
+      </w:r>
+    </w:p>
+    <w:p>
+      <w:pPr>
+        <w:pStyle w:val="Heading2"/>
+      </w:pPr>
+      <w:r>
+        <w:t xml:space="preserve">7.1 New state</w:t>
+      </w:r>
+    </w:p>
+    <w:p>
+      <w:r>
+        <w:t xml:space="preserve">One new table records agent activity. Every row captures the session and object it concerns, the agent and phase, a digest of the inputs, the change the agent made, the validation verdict, whether it was applied, the prior value it replaced, the model identifier, and token counts. Because the agent writes rather than suggests, this table is doing three jobs at once: it is the audit trail, the mechanism that makes any individual change reversible, and the cost ledger. It also feeds the scenario-frequency analysis described in section 5.5.</w:t>
+      </w:r>
+    </w:p>
+    <w:p>
+      <w:r>
+        <w:t xml:space="preserve">Three further tables hold the post-load conversation: the diagnoses written for failing objects, the per-session messages with the assistant, and the proposals awaiting a decision, each with its before/after preview and the diagnosis it came from. An applied proposal writes its changes into the same change log under its own run, so a reviewer can tell a change the agent made on its own from one a person approved.</w:t>
+      </w:r>
+    </w:p>
+    <w:p>
+      <w:pPr>
+        <w:pStyle w:val="Heading2"/>
+      </w:pPr>
+      <w:r>
+        <w:t xml:space="preserve">7.2 Existing state the agents depend on</w:t>
       </w:r>
     </w:p>
     <w:p>
@@ -3363,7 +3451,13 @@
         <w:spacing w:before="40" w:after="100"/>
       </w:pPr>
       <w:r>
-        <w:t xml:space="preserve">An agent action in Step 4 alongside the existing auto-suggest.</w:t>
+        <w:rPr>
+          <w:b/>
+        </w:rPr>
+        <w:t xml:space="preserve">Mapping configurations</w:t>
+      </w:r>
+      <w:r>
+        <w:t xml:space="preserve">— the only design-time write target. The agent adds transform functions, their parameters, and load priorities to the same structure the wizard already saves; nothing structurally new is introduced, which is why its output needs no special handling downstream.</w:t>
       </w:r>
     </w:p>
     <w:p>
@@ -3376,7 +3470,13 @@
         <w:spacing w:before="40" w:after="100"/>
       </w:pPr>
       <w:r>
-        <w:t xml:space="preserve">A change-log panel rather than an approval queue: each item states what was wired, on which field, and why, with a revert control. The default is that the work is done; the user is auditing it, not completing it.</w:t>
+        <w:rPr>
+          <w:b/>
+        </w:rPr>
+        <w:t xml:space="preserve">Identifier maps</w:t>
+      </w:r>
+      <w:r>
+        <w:t xml:space="preserve">— populated during load, read by lookup transforms. The agent registers them as part of wiring a relationship, always deriving the name from the shared naming helper rather than composing one. Hand-built names are the most common relationship defect in the current process, and the validator checks for exactly this before anything is written.</w:t>
       </w:r>
     </w:p>
     <w:p>
@@ -3389,7 +3489,369 @@
         <w:spacing w:before="40" w:after="100"/>
       </w:pPr>
       <w:r>
-        <w:t xml:space="preserve">A separate, prominent list of blockers the agent declined to guess at — these are the only items that actually need a human decision, and they should not be buried among the changes it already handled.</w:t>
+        <w:rPr>
+          <w:b/>
+        </w:rPr>
+        <w:t xml:space="preserve">Job and batch records</w:t>
+      </w:r>
+      <w:r>
+        <w:t xml:space="preserve">— repair retries reuse the same job identifiers so run history stays coherent and a repaired run reads as one run.</w:t>
+      </w:r>
+    </w:p>
+    <w:p>
+      <w:pPr>
+        <w:pStyle w:val="Heading2"/>
+      </w:pPr>
+      <w:r>
+        <w:t xml:space="preserve">7.3 Interfaces</w:t>
+      </w:r>
+    </w:p>
+    <w:tbl>
+      <w:tblPr>
+        <w:tblW w:w="9638" w:type="dxa"/>
+        <w:tblBorders>
+          <w:top w:val="single" w:sz="4" w:space="0" w:color="D5DDE5"/>
+          <w:left w:val="single" w:sz="4" w:space="0" w:color="D5DDE5"/>
+          <w:bottom w:val="single" w:sz="4" w:space="0" w:color="D5DDE5"/>
+          <w:right w:val="single" w:sz="4" w:space="0" w:color="D5DDE5"/>
+          <w:insideH w:val="single" w:sz="4" w:space="0" w:color="D5DDE5"/>
+          <w:insideV w:val="single" w:sz="4" w:space="0" w:color="D5DDE5"/>
+        </w:tblBorders>
+        <w:tblLayout w:type="fixed"/>
+        <w:tblCellMar>
+          <w:top w:w="70" w:type="dxa"/>
+          <w:left w:w="100" w:type="dxa"/>
+          <w:bottom w:w="70" w:type="dxa"/>
+          <w:right w:w="100" w:type="dxa"/>
+        </w:tblCellMar>
+      </w:tblPr>
+      <w:tblGrid>
+        <w:gridCol w:w="2051"/>
+        <w:gridCol w:w="7587"/>
+      </w:tblGrid>
+      <w:tr>
+        <w:trPr>
+          <w:cantSplit/>
+          <w:tblHeader/>
+        </w:trPr>
+        <w:tc>
+          <w:tcPr>
+            <w:tcW w:w="2051" w:type="dxa"/>
+            <w:shd w:val="clear" w:color="auto" w:fill="E8F1F8"/>
+            <w:vAlign w:val="top"/>
+          </w:tcPr>
+          <w:p>
+            <w:pPr>
+              <w:spacing w:before="20" w:after="20" w:line="240" w:lineRule="auto"/>
+            </w:pPr>
+            <w:r>
+              <w:rPr>
+                <w:b/>
+                <w:color w:val="2C5F7C"/>
+                <w:sz w:val="19"/>
+                <w:szCs w:val="19"/>
+              </w:rPr>
+              <w:t xml:space="preserve">Interface</w:t>
+            </w:r>
+          </w:p>
+        </w:tc>
+        <w:tc>
+          <w:tcPr>
+            <w:tcW w:w="7587" w:type="dxa"/>
+            <w:shd w:val="clear" w:color="auto" w:fill="E8F1F8"/>
+            <w:vAlign w:val="top"/>
+          </w:tcPr>
+          <w:p>
+            <w:pPr>
+              <w:spacing w:before="20" w:after="20" w:line="240" w:lineRule="auto"/>
+            </w:pPr>
+            <w:r>
+              <w:rPr>
+                <w:b/>
+                <w:color w:val="2C5F7C"/>
+                <w:sz w:val="19"/>
+                <w:szCs w:val="19"/>
+              </w:rPr>
+              <w:t xml:space="preserve">Purpose</w:t>
+            </w:r>
+          </w:p>
+        </w:tc>
+      </w:tr>
+      <w:tr>
+        <w:tc>
+          <w:tcPr>
+            <w:tcW w:w="2051" w:type="dxa"/>
+            <w:vAlign w:val="top"/>
+          </w:tcPr>
+          <w:p>
+            <w:pPr>
+              <w:spacing w:before="20" w:after="20" w:line="240" w:lineRule="auto"/>
+            </w:pPr>
+            <w:r>
+              <w:rPr>
+                <w:sz w:val="19"/>
+                <w:szCs w:val="19"/>
+              </w:rPr>
+              <w:t xml:space="preserve">Resolve endpoint</w:t>
+            </w:r>
+          </w:p>
+        </w:tc>
+        <w:tc>
+          <w:tcPr>
+            <w:tcW w:w="7587" w:type="dxa"/>
+            <w:vAlign w:val="top"/>
+          </w:tcPr>
+          <w:p>
+            <w:pPr>
+              <w:spacing w:before="20" w:after="20" w:line="240" w:lineRule="auto"/>
+            </w:pPr>
+            <w:r>
+              <w:rPr>
+                <w:sz w:val="19"/>
+                <w:szCs w:val="19"/>
+              </w:rPr>
+              <w:t xml:space="preserve">Takes the current selection and credential references. Runs the agent, validates its conclusions, writes the resulting configuration, and returns a change log, the outstanding blockers, and token usage.</w:t>
+            </w:r>
+          </w:p>
+        </w:tc>
+      </w:tr>
+      <w:tr>
+        <w:tc>
+          <w:tcPr>
+            <w:tcW w:w="2051" w:type="dxa"/>
+            <w:vAlign w:val="top"/>
+          </w:tcPr>
+          <w:p>
+            <w:pPr>
+              <w:spacing w:before="20" w:after="20" w:line="240" w:lineRule="auto"/>
+            </w:pPr>
+            <w:r>
+              <w:rPr>
+                <w:sz w:val="19"/>
+                <w:szCs w:val="19"/>
+              </w:rPr>
+              <w:t xml:space="preserve">Preview mode on the same endpoint</w:t>
+            </w:r>
+          </w:p>
+        </w:tc>
+        <w:tc>
+          <w:tcPr>
+            <w:tcW w:w="7587" w:type="dxa"/>
+            <w:vAlign w:val="top"/>
+          </w:tcPr>
+          <w:p>
+            <w:pPr>
+              <w:spacing w:before="20" w:after="20" w:line="240" w:lineRule="auto"/>
+            </w:pPr>
+            <w:r>
+              <w:rPr>
+                <w:sz w:val="19"/>
+                <w:szCs w:val="19"/>
+              </w:rPr>
+              <w:t xml:space="preserve">Identical analysis with the write suppressed. Useful for a first run on an unfamiliar client dataset, and for testing.</w:t>
+            </w:r>
+          </w:p>
+        </w:tc>
+      </w:tr>
+      <w:tr>
+        <w:tc>
+          <w:tcPr>
+            <w:tcW w:w="2051" w:type="dxa"/>
+            <w:vAlign w:val="top"/>
+          </w:tcPr>
+          <w:p>
+            <w:pPr>
+              <w:spacing w:before="20" w:after="20" w:line="240" w:lineRule="auto"/>
+            </w:pPr>
+            <w:r>
+              <w:rPr>
+                <w:sz w:val="19"/>
+                <w:szCs w:val="19"/>
+              </w:rPr>
+              <w:t xml:space="preserve">Revert endpoint</w:t>
+            </w:r>
+          </w:p>
+        </w:tc>
+        <w:tc>
+          <w:tcPr>
+            <w:tcW w:w="7587" w:type="dxa"/>
+            <w:vAlign w:val="top"/>
+          </w:tcPr>
+          <w:p>
+            <w:pPr>
+              <w:spacing w:before="20" w:after="20" w:line="240" w:lineRule="auto"/>
+            </w:pPr>
+            <w:r>
+              <w:rPr>
+                <w:sz w:val="19"/>
+                <w:szCs w:val="19"/>
+              </w:rPr>
+              <w:t xml:space="preserve">Takes a change reference and restores the prior value from the audit record. Reversal is per item, not per run.</w:t>
+            </w:r>
+          </w:p>
+        </w:tc>
+      </w:tr>
+      <w:tr>
+        <w:tc>
+          <w:tcPr>
+            <w:tcW w:w="2051" w:type="dxa"/>
+            <w:vAlign w:val="top"/>
+          </w:tcPr>
+          <w:p>
+            <w:pPr>
+              <w:spacing w:before="20" w:after="20" w:line="240" w:lineRule="auto"/>
+            </w:pPr>
+            <w:r>
+              <w:rPr>
+                <w:sz w:val="19"/>
+                <w:szCs w:val="19"/>
+              </w:rPr>
+              <w:t xml:space="preserve">Notices endpoint</w:t>
+            </w:r>
+          </w:p>
+        </w:tc>
+        <w:tc>
+          <w:tcPr>
+            <w:tcW w:w="7587" w:type="dxa"/>
+            <w:vAlign w:val="top"/>
+          </w:tcPr>
+          <w:p>
+            <w:pPr>
+              <w:spacing w:before="20" w:after="20" w:line="240" w:lineRule="auto"/>
+            </w:pPr>
+            <w:r>
+              <w:rPr>
+                <w:sz w:val="19"/>
+                <w:szCs w:val="19"/>
+              </w:rPr>
+              <w:t xml:space="preserve">Serves current relationship notices for the pre-launch banner and the run view, limited to the current migration attempt so a finding already fixed does not read as still true.</w:t>
+            </w:r>
+          </w:p>
+        </w:tc>
+      </w:tr>
+      <w:tr>
+        <w:tc>
+          <w:tcPr>
+            <w:tcW w:w="2051" w:type="dxa"/>
+            <w:vAlign w:val="top"/>
+          </w:tcPr>
+          <w:p>
+            <w:pPr>
+              <w:spacing w:before="20" w:after="20" w:line="240" w:lineRule="auto"/>
+            </w:pPr>
+            <w:r>
+              <w:rPr>
+                <w:sz w:val="19"/>
+                <w:szCs w:val="19"/>
+              </w:rPr>
+              <w:t xml:space="preserve">Diagnosis endpoints</w:t>
+            </w:r>
+          </w:p>
+        </w:tc>
+        <w:tc>
+          <w:tcPr>
+            <w:tcW w:w="7587" w:type="dxa"/>
+            <w:vAlign w:val="top"/>
+          </w:tcPr>
+          <w:p>
+            <w:pPr>
+              <w:spacing w:before="20" w:after="20" w:line="240" w:lineRule="auto"/>
+            </w:pPr>
+            <w:r>
+              <w:rPr>
+                <w:sz w:val="19"/>
+                <w:szCs w:val="19"/>
+              </w:rPr>
+              <w:t xml:space="preserve">List the latest diagnosis per failing object, run one on demand, and turn one of its suggested fixes into a proposal without a model call.</w:t>
+            </w:r>
+          </w:p>
+        </w:tc>
+      </w:tr>
+      <w:tr>
+        <w:tc>
+          <w:tcPr>
+            <w:tcW w:w="2051" w:type="dxa"/>
+            <w:vAlign w:val="top"/>
+          </w:tcPr>
+          <w:p>
+            <w:pPr>
+              <w:spacing w:before="20" w:after="20" w:line="240" w:lineRule="auto"/>
+            </w:pPr>
+            <w:r>
+              <w:rPr>
+                <w:sz w:val="19"/>
+                <w:szCs w:val="19"/>
+              </w:rPr>
+              <w:t xml:space="preserve">Assistant endpoints</w:t>
+            </w:r>
+          </w:p>
+        </w:tc>
+        <w:tc>
+          <w:tcPr>
+            <w:tcW w:w="7587" w:type="dxa"/>
+            <w:vAlign w:val="top"/>
+          </w:tcPr>
+          <w:p>
+            <w:pPr>
+              <w:spacing w:before="20" w:after="20" w:line="240" w:lineRule="auto"/>
+            </w:pPr>
+            <w:r>
+              <w:rPr>
+                <w:sz w:val="19"/>
+                <w:szCs w:val="19"/>
+              </w:rPr>
+              <w:t xml:space="preserve">One conversational turn, the conversation history, and apply or reject for a stored proposal.</w:t>
+            </w:r>
+          </w:p>
+        </w:tc>
+      </w:tr>
+      <w:tr>
+        <w:tc>
+          <w:tcPr>
+            <w:tcW w:w="2051" w:type="dxa"/>
+            <w:vAlign w:val="top"/>
+          </w:tcPr>
+          <w:p>
+            <w:pPr>
+              <w:spacing w:before="20" w:after="20" w:line="240" w:lineRule="auto"/>
+            </w:pPr>
+            <w:r>
+              <w:rPr>
+                <w:sz w:val="19"/>
+                <w:szCs w:val="19"/>
+              </w:rPr>
+              <w:t xml:space="preserve">Resolution history endpoint</w:t>
+            </w:r>
+          </w:p>
+        </w:tc>
+        <w:tc>
+          <w:tcPr>
+            <w:tcW w:w="7587" w:type="dxa"/>
+            <w:vAlign w:val="top"/>
+          </w:tcPr>
+          <w:p>
+            <w:pPr>
+              <w:spacing w:before="20" w:after="20" w:line="240" w:lineRule="auto"/>
+            </w:pPr>
+            <w:r>
+              <w:rPr>
+                <w:sz w:val="19"/>
+                <w:szCs w:val="19"/>
+              </w:rPr>
+              <w:t xml:space="preserve">Every change an agent applied in the session, grouped by run and tagged with where it came from.</w:t>
+            </w:r>
+          </w:p>
+        </w:tc>
+      </w:tr>
+    </w:tbl>
+    <w:p>
+      <w:pPr>
+        <w:spacing w:after="120"/>
+      </w:pPr>
+    </w:p>
+    <w:p>
+      <w:r>
+        <w:t xml:space="preserve">Interface changes in the web application:</w:t>
       </w:r>
     </w:p>
     <w:p>
@@ -3402,7 +3864,7 @@
         <w:spacing w:before="40" w:after="100"/>
       </w:pPr>
       <w:r>
-        <w:t xml:space="preserve">A notice strip on each mapping card, colour-coded by severity, driven by the open-ended notice categories.</w:t>
+        <w:t xml:space="preserve">An agent action in Step 4 alongside the existing auto-suggest.</w:t>
       </w:r>
     </w:p>
     <w:p>
@@ -3415,7 +3877,72 @@
         <w:spacing w:before="40" w:after="100"/>
       </w:pPr>
       <w:r>
+        <w:t xml:space="preserve">A change-log panel rather than an approval queue: each item states what was wired, on which field, and why, with a revert control. The default is that the work is done; the user is auditing it, not completing it.</w:t>
+      </w:r>
+    </w:p>
+    <w:p>
+      <w:pPr>
+        <w:pStyle w:val="ListParagraph"/>
+        <w:numPr>
+          <w:ilvl w:val="0"/>
+          <w:numId w:val="1"/>
+        </w:numPr>
+        <w:spacing w:before="40" w:after="100"/>
+      </w:pPr>
+      <w:r>
+        <w:t xml:space="preserve">A separate, prominent list of blockers the agent declined to guess at — these are the only items that actually need a human decision, and they should not be buried among the changes it already handled.</w:t>
+      </w:r>
+    </w:p>
+    <w:p>
+      <w:pPr>
+        <w:pStyle w:val="ListParagraph"/>
+        <w:numPr>
+          <w:ilvl w:val="0"/>
+          <w:numId w:val="1"/>
+        </w:numPr>
+        <w:spacing w:before="40" w:after="100"/>
+      </w:pPr>
+      <w:r>
+        <w:t xml:space="preserve">A notice strip on each mapping card, colour-coded by severity, driven by the open-ended notice categories.</w:t>
+      </w:r>
+    </w:p>
+    <w:p>
+      <w:pPr>
+        <w:pStyle w:val="ListParagraph"/>
+        <w:numPr>
+          <w:ilvl w:val="0"/>
+          <w:numId w:val="1"/>
+        </w:numPr>
+        <w:spacing w:before="40" w:after="100"/>
+      </w:pPr>
+      <w:r>
         <w:t xml:space="preserve">A repair state on the progress view, so an in-flight repair and its rationale are visible while it happens rather than only in the final error list.</w:t>
+      </w:r>
+    </w:p>
+    <w:p>
+      <w:pPr>
+        <w:pStyle w:val="ListParagraph"/>
+        <w:numPr>
+          <w:ilvl w:val="0"/>
+          <w:numId w:val="1"/>
+        </w:numPr>
+        <w:spacing w:before="40" w:after="100"/>
+      </w:pPr>
+      <w:r>
+        <w:t xml:space="preserve">An assistant panel in the run view: diagnoses with their ranked fixes, the conversation, pending proposals with a before/after, Apply and Reject, and a re-run of the affected object.</w:t>
+      </w:r>
+    </w:p>
+    <w:p>
+      <w:pPr>
+        <w:pStyle w:val="ListParagraph"/>
+        <w:numPr>
+          <w:ilvl w:val="0"/>
+          <w:numId w:val="1"/>
+        </w:numPr>
+        <w:spacing w:before="40" w:after="100"/>
+      </w:pPr>
+      <w:r>
+        <w:t xml:space="preserve">A resolutions drawer listing every applied agent change for the session, with revert.</w:t>
       </w:r>
     </w:p>
     <w:p>
@@ -4369,6 +4896,25 @@
     </w:p>
     <w:p>
       <w:pPr>
+        <w:pBdr>
+          <w:left w:val="single" w:sz="18" w:space="8" w:color="1F6B4A"/>
+        </w:pBdr>
+        <w:shd w:val="clear" w:color="auto" w:fill="EAF6F0"/>
+        <w:spacing w:before="200" w:after="200"/>
+        <w:ind w:left="170" w:right="140"/>
+      </w:pPr>
+      <w:r>
+        <w:rPr>
+          <w:b/>
+        </w:rPr>
+        <w:t xml:space="preserve">Delivered beyond this plan.</w:t>
+      </w:r>
+      <w:r>
+        <w:t xml:space="preserve">All nine stages are complete. Since then, the repair stage has gained fixed rules that run ahead of the model (6.3), a Diagnosis Agent for failures repair cannot fix, and an assistant whose fixes are applied only on approval (6.4). Alongside these: a preview-first way to fill a single column on records that have already migrated, and field-matching confidence scored on meaning rather than name resemblance.</w:t>
+      </w:r>
+    </w:p>
+    <w:p>
+      <w:pPr>
         <w:pStyle w:val="Heading1"/>
       </w:pPr>
       <w:r>
@@ -4395,8 +4941,8 @@
         </w:tblCellMar>
       </w:tblPr>
       <w:tblGrid>
-        <w:gridCol w:w="1536"/>
-        <w:gridCol w:w="8102"/>
+        <w:gridCol w:w="1422"/>
+        <w:gridCol w:w="8216"/>
       </w:tblGrid>
       <w:tr>
         <w:trPr>
@@ -4405,7 +4951,7 @@
         </w:trPr>
         <w:tc>
           <w:tcPr>
-            <w:tcW w:w="1536" w:type="dxa"/>
+            <w:tcW w:w="1422" w:type="dxa"/>
             <w:shd w:val="clear" w:color="auto" w:fill="E8F1F8"/>
             <w:vAlign w:val="top"/>
           </w:tcPr>
@@ -4426,7 +4972,7 @@
         </w:tc>
         <w:tc>
           <w:tcPr>
-            <w:tcW w:w="8102" w:type="dxa"/>
+            <w:tcW w:w="8216" w:type="dxa"/>
             <w:shd w:val="clear" w:color="auto" w:fill="E8F1F8"/>
             <w:vAlign w:val="top"/>
           </w:tcPr>
@@ -4449,7 +4995,7 @@
       <w:tr>
         <w:tc>
           <w:tcPr>
-            <w:tcW w:w="1536" w:type="dxa"/>
+            <w:tcW w:w="1422" w:type="dxa"/>
             <w:vAlign w:val="top"/>
           </w:tcPr>
           <w:p>
@@ -4467,7 +5013,7 @@
         </w:tc>
         <w:tc>
           <w:tcPr>
-            <w:tcW w:w="8102" w:type="dxa"/>
+            <w:tcW w:w="8216" w:type="dxa"/>
             <w:vAlign w:val="top"/>
           </w:tcPr>
           <w:p>
@@ -4487,7 +5033,7 @@
       <w:tr>
         <w:tc>
           <w:tcPr>
-            <w:tcW w:w="1536" w:type="dxa"/>
+            <w:tcW w:w="1422" w:type="dxa"/>
             <w:vAlign w:val="top"/>
           </w:tcPr>
           <w:p>
@@ -4505,27 +5051,65 @@
         </w:tc>
         <w:tc>
           <w:tcPr>
-            <w:tcW w:w="8102" w:type="dxa"/>
-            <w:vAlign w:val="top"/>
-          </w:tcPr>
-          <w:p>
-            <w:pPr>
-              <w:spacing w:before="20" w:after="20" w:line="240" w:lineRule="auto"/>
-            </w:pPr>
-            <w:r>
-              <w:rPr>
-                <w:sz w:val="19"/>
-                <w:szCs w:val="19"/>
-              </w:rPr>
-              <w:t xml:space="preserve">Schema and error text only — field names, types, allowed values, and Salesforce error messages. No record payloads, no credentials, no attachments</w:t>
-            </w:r>
-          </w:p>
-        </w:tc>
-      </w:tr>
-      <w:tr>
-        <w:tc>
-          <w:tcPr>
-            <w:tcW w:w="1536" w:type="dxa"/>
+            <w:tcW w:w="8216" w:type="dxa"/>
+            <w:vAlign w:val="top"/>
+          </w:tcPr>
+          <w:p>
+            <w:pPr>
+              <w:spacing w:before="20" w:after="20" w:line="240" w:lineRule="auto"/>
+            </w:pPr>
+            <w:r>
+              <w:rPr>
+                <w:sz w:val="19"/>
+                <w:szCs w:val="19"/>
+              </w:rPr>
+              <w:t xml:space="preserve">Schema and error text — field names, types, allowed values, and Salesforce error messages — plus, for repair and diagnosis only, a capped and truncated sample of rejected rows and source-column profiles. One setting removes those values. No extract dumps, no credentials, no attachments</w:t>
+            </w:r>
+          </w:p>
+        </w:tc>
+      </w:tr>
+      <w:tr>
+        <w:tc>
+          <w:tcPr>
+            <w:tcW w:w="1422" w:type="dxa"/>
+            <w:vAlign w:val="top"/>
+          </w:tcPr>
+          <w:p>
+            <w:pPr>
+              <w:spacing w:before="20" w:after="20" w:line="240" w:lineRule="auto"/>
+            </w:pPr>
+            <w:r>
+              <w:rPr>
+                <w:sz w:val="19"/>
+                <w:szCs w:val="19"/>
+              </w:rPr>
+              <w:t xml:space="preserve">Fixes that need judgement</w:t>
+            </w:r>
+          </w:p>
+        </w:tc>
+        <w:tc>
+          <w:tcPr>
+            <w:tcW w:w="8216" w:type="dxa"/>
+            <w:vAlign w:val="top"/>
+          </w:tcPr>
+          <w:p>
+            <w:pPr>
+              <w:spacing w:before="20" w:after="20" w:line="240" w:lineRule="auto"/>
+            </w:pPr>
+            <w:r>
+              <w:rPr>
+                <w:sz w:val="19"/>
+                <w:szCs w:val="19"/>
+              </w:rPr>
+              <w:t xml:space="preserve">Diagnosed and offered as proposals with a before/after. Nothing is applied without a person, applying never calls the model, and a proposal made stale by a later edit is refused rather than applied over it</w:t>
+            </w:r>
+          </w:p>
+        </w:tc>
+      </w:tr>
+      <w:tr>
+        <w:tc>
+          <w:tcPr>
+            <w:tcW w:w="1422" w:type="dxa"/>
             <w:vAlign w:val="top"/>
           </w:tcPr>
           <w:p>
@@ -4543,7 +5127,7 @@
         </w:tc>
         <w:tc>
           <w:tcPr>
-            <w:tcW w:w="8102" w:type="dxa"/>
+            <w:tcW w:w="8216" w:type="dxa"/>
             <w:vAlign w:val="top"/>
           </w:tcPr>
           <w:p>
@@ -4563,7 +5147,7 @@
       <w:tr>
         <w:tc>
           <w:tcPr>
-            <w:tcW w:w="1536" w:type="dxa"/>
+            <w:tcW w:w="1422" w:type="dxa"/>
             <w:vAlign w:val="top"/>
           </w:tcPr>
           <w:p>
@@ -4581,27 +5165,27 @@
         </w:tc>
         <w:tc>
           <w:tcPr>
-            <w:tcW w:w="8102" w:type="dxa"/>
-            <w:vAlign w:val="top"/>
-          </w:tcPr>
-          <w:p>
-            <w:pPr>
-              <w:spacing w:before="20" w:after="20" w:line="240" w:lineRule="auto"/>
-            </w:pPr>
-            <w:r>
-              <w:rPr>
-                <w:sz w:val="19"/>
-                <w:szCs w:val="19"/>
-              </w:rPr>
-              <w:t xml:space="preserve">A resolution pass is a modest number of tokens against a schema, not against data; a repair is smaller still. Both are capped and logged per call, so spend is measurable per migration from day one</w:t>
-            </w:r>
-          </w:p>
-        </w:tc>
-      </w:tr>
-      <w:tr>
-        <w:tc>
-          <w:tcPr>
-            <w:tcW w:w="1536" w:type="dxa"/>
+            <w:tcW w:w="8216" w:type="dxa"/>
+            <w:vAlign w:val="top"/>
+          </w:tcPr>
+          <w:p>
+            <w:pPr>
+              <w:spacing w:before="20" w:after="20" w:line="240" w:lineRule="auto"/>
+            </w:pPr>
+            <w:r>
+              <w:rPr>
+                <w:sz w:val="19"/>
+                <w:szCs w:val="19"/>
+              </w:rPr>
+              <w:t xml:space="preserve">A resolution pass is a modest number of tokens against a schema, not against data; a repair is smaller still, and none at all when the fixed rules handle every error. All are capped and logged per call, so spend is measurable per migration from day one</w:t>
+            </w:r>
+          </w:p>
+        </w:tc>
+      </w:tr>
+      <w:tr>
+        <w:tc>
+          <w:tcPr>
+            <w:tcW w:w="1422" w:type="dxa"/>
             <w:vAlign w:val="top"/>
           </w:tcPr>
           <w:p>
@@ -4619,7 +5203,7 @@
         </w:tc>
         <w:tc>
           <w:tcPr>
-            <w:tcW w:w="8102" w:type="dxa"/>
+            <w:tcW w:w="8216" w:type="dxa"/>
             <w:vAlign w:val="top"/>
           </w:tcPr>
           <w:p>
@@ -4639,7 +5223,7 @@
       <w:tr>
         <w:tc>
           <w:tcPr>
-            <w:tcW w:w="1536" w:type="dxa"/>
+            <w:tcW w:w="1422" w:type="dxa"/>
             <w:vAlign w:val="top"/>
           </w:tcPr>
           <w:p>
@@ -4657,7 +5241,7 @@
         </w:tc>
         <w:tc>
           <w:tcPr>
-            <w:tcW w:w="8102" w:type="dxa"/>
+            <w:tcW w:w="8216" w:type="dxa"/>
             <w:vAlign w:val="top"/>
           </w:tcPr>
           <w:p>
@@ -4677,7 +5261,7 @@
       <w:tr>
         <w:tc>
           <w:tcPr>
-            <w:tcW w:w="1536" w:type="dxa"/>
+            <w:tcW w:w="1422" w:type="dxa"/>
             <w:vAlign w:val="top"/>
           </w:tcPr>
           <w:p>
@@ -4695,7 +5279,7 @@
         </w:tc>
         <w:tc>
           <w:tcPr>
-            <w:tcW w:w="8102" w:type="dxa"/>
+            <w:tcW w:w="8216" w:type="dxa"/>
             <w:vAlign w:val="top"/>
           </w:tcPr>
           <w:p>
@@ -4715,7 +5299,7 @@
       <w:tr>
         <w:tc>
           <w:tcPr>
-            <w:tcW w:w="1536" w:type="dxa"/>
+            <w:tcW w:w="1422" w:type="dxa"/>
             <w:vAlign w:val="top"/>
           </w:tcPr>
           <w:p>
@@ -4733,7 +5317,7 @@
         </w:tc>
         <w:tc>
           <w:tcPr>
-            <w:tcW w:w="8102" w:type="dxa"/>
+            <w:tcW w:w="8216" w:type="dxa"/>
             <w:vAlign w:val="top"/>
           </w:tcPr>
           <w:p>

</xml_diff>